<commit_message>
docs: fix Lab 7 task in technical specification
</commit_message>
<xml_diff>
--- a/docs/РПЗ Баженов ИУ5-51Б.docx
+++ b/docs/РПЗ Баженов ИУ5-51Б.docx
@@ -4828,7 +4828,7 @@
       </w:pPr>
       <w:r>
         <w:lastRenderedPageBreak/>
-        <w:t xml:space="preserve">3.6 Разработка интерфейса создателя: аутентификация и добавление команд через </w:t>
+        <w:t xml:space="preserve">3.6 Разработка интерфейса создателя: аутентификация, хранение фильтров и добавление команд через </w:t>
       </w:r>
       <w:proofErr w:type="spellStart"/>
       <w:r>
@@ -4878,31 +4878,7 @@
         <w:jc w:val="both"/>
       </w:pPr>
       <w:r>
-        <w:t xml:space="preserve">3.7 Внедрение адаптивности, хранения фильтров в </w:t>
-      </w:r>
-      <w:proofErr w:type="spellStart"/>
-      <w:r>
-        <w:t>Redux</w:t>
-      </w:r>
-      <w:proofErr w:type="spellEnd"/>
-      <w:r>
-        <w:t xml:space="preserve"> </w:t>
-      </w:r>
-      <w:proofErr w:type="spellStart"/>
-      <w:r>
-        <w:t>Toolkit</w:t>
-      </w:r>
-      <w:proofErr w:type="spellEnd"/>
-      <w:r>
-        <w:t xml:space="preserve">, прогрессивного веб-приложения (PWA) и нативного приложения на </w:t>
-      </w:r>
-      <w:proofErr w:type="spellStart"/>
-      <w:r>
-        <w:t>Tauri</w:t>
-      </w:r>
-      <w:proofErr w:type="spellEnd"/>
-      <w:r>
-        <w:t>.</w:t>
+        <w:t xml:space="preserve">3.7 Внедрение адаптивности и прогрессивного веб-приложения (PWA), поддержка HTTPS на реверс-прокси Node.js и подключение мобильного устройства к бэкенду по IP-адресу в локальной сети.</w:t>
       </w:r>
     </w:p>
     <w:p>

</xml_diff>

<commit_message>
docs: update ER and class diagrams in report
</commit_message>
<xml_diff>
--- a/docs/РПЗ Баженов ИУ5-51Б.docx
+++ b/docs/РПЗ Баженов ИУ5-51Б.docx
@@ -1500,7 +1500,7 @@
         </w:rPr>
         <w:drawing>
           <wp:inline distT="0" distB="0" distL="0" distR="0" wp14:anchorId="2EF2399F" wp14:editId="1D996381">
-            <wp:extent cx="5334000" cy="3457575"/>
+            <wp:extent cx="5334000" cy="4692299"/>
             <wp:effectExtent l="0" t="0" r="0" b="0"/>
             <wp:docPr id="869059439" name="Рисунок 869059439"/>
             <wp:cNvGraphicFramePr>
@@ -1525,7 +1525,7 @@
                   <pic:spPr bwMode="auto">
                     <a:xfrm>
                       <a:off x="0" y="0"/>
-                      <a:ext cx="5334000" cy="3457575"/>
+                      <a:ext cx="5334000" cy="4692299"/>
                     </a:xfrm>
                     <a:prstGeom prst="rect">
                       <a:avLst/>
@@ -3596,7 +3596,7 @@
         <w:lastRenderedPageBreak/>
         <w:drawing>
           <wp:inline distT="0" distB="0" distL="0" distR="0" wp14:anchorId="208AFE11" wp14:editId="0F41A07B">
-            <wp:extent cx="4476750" cy="6153150"/>
+            <wp:extent cx="5152025" cy="6153150"/>
             <wp:effectExtent l="0" t="0" r="0" b="0"/>
             <wp:docPr id="1982393053" name="Рисунок 1982393053"/>
             <wp:cNvGraphicFramePr>
@@ -3621,7 +3621,7 @@
                   <pic:spPr bwMode="auto">
                     <a:xfrm>
                       <a:off x="0" y="0"/>
-                      <a:ext cx="4476750" cy="6153150"/>
+                      <a:ext cx="5152025" cy="6153150"/>
                     </a:xfrm>
                     <a:prstGeom prst="rect">
                       <a:avLst/>

</xml_diff>

<commit_message>
docs: add hardware requirements calculation to report
</commit_message>
<xml_diff>
--- a/docs/РПЗ Баженов ИУ5-51Б.docx
+++ b/docs/РПЗ Баженов ИУ5-51Б.docx
@@ -3645,6 +3645,2294 @@
     </w:p>
     <w:p>
       <w:pPr>
+        <w:pageBreakBefore/>
+        <w:spacing w:line="360" w:lineRule="auto"/>
+        <w:ind w:firstLine="709"/>
+        <w:jc w:val="both"/>
+      </w:pPr>
+      <w:r>
+        <w:t xml:space="preserve">В системе работают 500 пользователей и 20 создателей, рабочий день – 8 часов (28 800 с). Пользователь за день просматривает 40 команд RISC-V и ставит 10 лайков, создатель добавляет 1 команду – формулы (1)⁠–⁠(3). По диаграмме последовательности (рисунок 3) просмотр и лайк – один HTTP-запрос, добавление команды – восемь. RPS, число ядер (</w:t>
+      </w:r>
+      <w:r>
+        <w:t xml:space="preserve">RPS</w:t>
+      </w:r>
+      <w:r>
+        <w:rPr>
+          <w:vertAlign w:val="subscript"/>
+        </w:rPr>
+        <w:t xml:space="preserve">core</w:t>
+      </w:r>
+      <w:r>
+        <w:t xml:space="preserve"> = 500 запросов/с, </w:t>
+      </w:r>
+      <w:r>
+        <w:t xml:space="preserve">k</w:t>
+      </w:r>
+      <w:r>
+        <w:rPr>
+          <w:vertAlign w:val="subscript"/>
+        </w:rPr>
+        <w:t xml:space="preserve">reserve</w:t>
+      </w:r>
+      <w:r>
+        <w:t xml:space="preserve"> = 1,5) и ОП (4 ГБ на ядро) – по формулам (4)⁠–⁠(6).</w:t>
+      </w:r>
+    </w:p>
+    <w:p>
+      <w:pPr>
+        <w:tabs>
+          <w:tab w:val="center" w:pos="4819"/>
+          <w:tab w:val="right" w:pos="9638"/>
+        </w:tabs>
+        <w:spacing w:before="0" w:after="0"/>
+      </w:pPr>
+      <w:r>
+        <w:tab/>
+      </w:r>
+      <m:oMath>
+        <m:sSub>
+          <m:e>
+            <m:r>
+              <m:rPr>
+                <m:sty m:val="p"/>
+              </m:rPr>
+              <w:rPr>
+                <w:rFonts w:ascii="Cambria Math" w:hAnsi="Cambria Math"/>
+                <w:sz w:val="28"/>
+                <w:szCs w:val="28"/>
+              </w:rPr>
+              <m:t xml:space="preserve">N</m:t>
+            </m:r>
+          </m:e>
+          <m:sub>
+            <m:r>
+              <m:rPr>
+                <m:sty m:val="p"/>
+              </m:rPr>
+              <w:rPr>
+                <w:rFonts w:ascii="Cambria Math" w:hAnsi="Cambria Math"/>
+                <w:sz w:val="28"/>
+                <w:szCs w:val="28"/>
+              </w:rPr>
+              <m:t xml:space="preserve">view</m:t>
+            </m:r>
+          </m:sub>
+        </m:sSub>
+        <m:r>
+          <m:rPr>
+            <m:sty m:val="p"/>
+          </m:rPr>
+          <w:rPr>
+            <w:rFonts w:ascii="Cambria Math" w:hAnsi="Cambria Math"/>
+            <w:sz w:val="28"/>
+            <w:szCs w:val="28"/>
+          </w:rPr>
+          <m:t xml:space="preserve">=500×40=20 000 просмотров/сутки</m:t>
+        </m:r>
+      </m:oMath>
+      <w:r>
+        <w:tab/>
+        <w:t>(1)</w:t>
+      </w:r>
+    </w:p>
+    <w:p>
+      <w:pPr>
+        <w:tabs>
+          <w:tab w:val="center" w:pos="4819"/>
+          <w:tab w:val="right" w:pos="9638"/>
+        </w:tabs>
+        <w:spacing w:before="0" w:after="0"/>
+      </w:pPr>
+      <w:r>
+        <w:tab/>
+      </w:r>
+      <m:oMath>
+        <m:sSub>
+          <m:e>
+            <m:r>
+              <m:rPr>
+                <m:sty m:val="p"/>
+              </m:rPr>
+              <w:rPr>
+                <w:rFonts w:ascii="Cambria Math" w:hAnsi="Cambria Math"/>
+                <w:sz w:val="28"/>
+                <w:szCs w:val="28"/>
+              </w:rPr>
+              <m:t xml:space="preserve">N</m:t>
+            </m:r>
+          </m:e>
+          <m:sub>
+            <m:r>
+              <m:rPr>
+                <m:sty m:val="p"/>
+              </m:rPr>
+              <w:rPr>
+                <w:rFonts w:ascii="Cambria Math" w:hAnsi="Cambria Math"/>
+                <w:sz w:val="28"/>
+                <w:szCs w:val="28"/>
+              </w:rPr>
+              <m:t xml:space="preserve">like</m:t>
+            </m:r>
+          </m:sub>
+        </m:sSub>
+        <m:r>
+          <m:rPr>
+            <m:sty m:val="p"/>
+          </m:rPr>
+          <w:rPr>
+            <w:rFonts w:ascii="Cambria Math" w:hAnsi="Cambria Math"/>
+            <w:sz w:val="28"/>
+            <w:szCs w:val="28"/>
+          </w:rPr>
+          <m:t xml:space="preserve">=500×10=5000 лайков/сутки</m:t>
+        </m:r>
+      </m:oMath>
+      <w:r>
+        <w:tab/>
+        <w:t>(2)</w:t>
+      </w:r>
+    </w:p>
+    <w:p>
+      <w:pPr>
+        <w:tabs>
+          <w:tab w:val="center" w:pos="4819"/>
+          <w:tab w:val="right" w:pos="9638"/>
+        </w:tabs>
+        <w:spacing w:before="0" w:after="0"/>
+      </w:pPr>
+      <w:r>
+        <w:tab/>
+      </w:r>
+      <m:oMath>
+        <m:sSub>
+          <m:e>
+            <m:r>
+              <m:rPr>
+                <m:sty m:val="p"/>
+              </m:rPr>
+              <w:rPr>
+                <w:rFonts w:ascii="Cambria Math" w:hAnsi="Cambria Math"/>
+                <w:sz w:val="28"/>
+                <w:szCs w:val="28"/>
+              </w:rPr>
+              <m:t xml:space="preserve">N</m:t>
+            </m:r>
+          </m:e>
+          <m:sub>
+            <m:r>
+              <m:rPr>
+                <m:sty m:val="p"/>
+              </m:rPr>
+              <w:rPr>
+                <w:rFonts w:ascii="Cambria Math" w:hAnsi="Cambria Math"/>
+                <w:sz w:val="28"/>
+                <w:szCs w:val="28"/>
+              </w:rPr>
+              <m:t xml:space="preserve">cmd</m:t>
+            </m:r>
+          </m:sub>
+        </m:sSub>
+        <m:r>
+          <m:rPr>
+            <m:sty m:val="p"/>
+          </m:rPr>
+          <w:rPr>
+            <w:rFonts w:ascii="Cambria Math" w:hAnsi="Cambria Math"/>
+            <w:sz w:val="28"/>
+            <w:szCs w:val="28"/>
+          </w:rPr>
+          <m:t xml:space="preserve">=20×1=20 команд/сутки</m:t>
+        </m:r>
+      </m:oMath>
+      <w:r>
+        <w:tab/>
+        <w:t>(3)</w:t>
+      </w:r>
+    </w:p>
+    <w:p>
+      <w:pPr>
+        <w:tabs>
+          <w:tab w:val="center" w:pos="4819"/>
+          <w:tab w:val="right" w:pos="9638"/>
+        </w:tabs>
+        <w:spacing w:before="0" w:after="0"/>
+      </w:pPr>
+      <w:r>
+        <w:tab/>
+      </w:r>
+      <m:oMath>
+        <m:eqArr>
+          <m:e>
+            <m:r>
+              <m:rPr>
+                <m:sty m:val="p"/>
+              </m:rPr>
+              <w:rPr>
+                <w:rFonts w:ascii="Cambria Math" w:hAnsi="Cambria Math"/>
+                <w:sz w:val="28"/>
+                <w:szCs w:val="28"/>
+              </w:rPr>
+              <m:t xml:space="preserve">RPS=</m:t>
+            </m:r>
+            <m:f>
+              <m:num>
+                <m:sSub>
+                  <m:e>
+                    <m:r>
+                      <m:rPr>
+                        <m:sty m:val="p"/>
+                      </m:rPr>
+                      <w:rPr>
+                        <w:rFonts w:ascii="Cambria Math" w:hAnsi="Cambria Math"/>
+                        <w:sz w:val="28"/>
+                        <w:szCs w:val="28"/>
+                      </w:rPr>
+                      <m:t xml:space="preserve">N</m:t>
+                    </m:r>
+                  </m:e>
+                  <m:sub>
+                    <m:r>
+                      <m:rPr>
+                        <m:sty m:val="p"/>
+                      </m:rPr>
+                      <w:rPr>
+                        <w:rFonts w:ascii="Cambria Math" w:hAnsi="Cambria Math"/>
+                        <w:sz w:val="28"/>
+                        <w:szCs w:val="28"/>
+                      </w:rPr>
+                      <m:t xml:space="preserve">view</m:t>
+                    </m:r>
+                  </m:sub>
+                </m:sSub>
+                <m:r>
+                  <m:rPr>
+                    <m:sty m:val="p"/>
+                  </m:rPr>
+                  <w:rPr>
+                    <w:rFonts w:ascii="Cambria Math" w:hAnsi="Cambria Math"/>
+                    <w:sz w:val="28"/>
+                    <w:szCs w:val="28"/>
+                  </w:rPr>
+                  <m:t xml:space="preserve">+</m:t>
+                </m:r>
+                <m:sSub>
+                  <m:e>
+                    <m:r>
+                      <m:rPr>
+                        <m:sty m:val="p"/>
+                      </m:rPr>
+                      <w:rPr>
+                        <w:rFonts w:ascii="Cambria Math" w:hAnsi="Cambria Math"/>
+                        <w:sz w:val="28"/>
+                        <w:szCs w:val="28"/>
+                      </w:rPr>
+                      <m:t xml:space="preserve">N</m:t>
+                    </m:r>
+                  </m:e>
+                  <m:sub>
+                    <m:r>
+                      <m:rPr>
+                        <m:sty m:val="p"/>
+                      </m:rPr>
+                      <w:rPr>
+                        <w:rFonts w:ascii="Cambria Math" w:hAnsi="Cambria Math"/>
+                        <w:sz w:val="28"/>
+                        <w:szCs w:val="28"/>
+                      </w:rPr>
+                      <m:t xml:space="preserve">like</m:t>
+                    </m:r>
+                  </m:sub>
+                </m:sSub>
+                <m:r>
+                  <m:rPr>
+                    <m:sty m:val="p"/>
+                  </m:rPr>
+                  <w:rPr>
+                    <w:rFonts w:ascii="Cambria Math" w:hAnsi="Cambria Math"/>
+                    <w:sz w:val="28"/>
+                    <w:szCs w:val="28"/>
+                  </w:rPr>
+                  <m:t xml:space="preserve">+8×</m:t>
+                </m:r>
+                <m:sSub>
+                  <m:e>
+                    <m:r>
+                      <m:rPr>
+                        <m:sty m:val="p"/>
+                      </m:rPr>
+                      <w:rPr>
+                        <w:rFonts w:ascii="Cambria Math" w:hAnsi="Cambria Math"/>
+                        <w:sz w:val="28"/>
+                        <w:szCs w:val="28"/>
+                      </w:rPr>
+                      <m:t xml:space="preserve">N</m:t>
+                    </m:r>
+                  </m:e>
+                  <m:sub>
+                    <m:r>
+                      <m:rPr>
+                        <m:sty m:val="p"/>
+                      </m:rPr>
+                      <w:rPr>
+                        <w:rFonts w:ascii="Cambria Math" w:hAnsi="Cambria Math"/>
+                        <w:sz w:val="28"/>
+                        <w:szCs w:val="28"/>
+                      </w:rPr>
+                      <m:t xml:space="preserve">cmd</m:t>
+                    </m:r>
+                  </m:sub>
+                </m:sSub>
+              </m:num>
+              <m:den>
+                <m:r>
+                  <m:rPr>
+                    <m:sty m:val="p"/>
+                  </m:rPr>
+                  <w:rPr>
+                    <w:rFonts w:ascii="Cambria Math" w:hAnsi="Cambria Math"/>
+                    <w:sz w:val="28"/>
+                    <w:szCs w:val="28"/>
+                  </w:rPr>
+                  <m:t xml:space="preserve">28 800</m:t>
+                </m:r>
+              </m:den>
+            </m:f>
+            <m:r>
+              <m:rPr>
+                <m:sty m:val="p"/>
+              </m:rPr>
+              <w:rPr>
+                <w:rFonts w:ascii="Cambria Math" w:hAnsi="Cambria Math"/>
+                <w:sz w:val="28"/>
+                <w:szCs w:val="28"/>
+              </w:rPr>
+              <m:t xml:space="preserve">=</m:t>
+            </m:r>
+          </m:e>
+          <m:e>
+            <m:r>
+              <m:rPr>
+                <m:sty m:val="p"/>
+              </m:rPr>
+              <w:rPr>
+                <w:rFonts w:ascii="Cambria Math" w:hAnsi="Cambria Math"/>
+                <w:sz w:val="28"/>
+                <w:szCs w:val="28"/>
+              </w:rPr>
+              <m:t xml:space="preserve">=</m:t>
+            </m:r>
+            <m:f>
+              <m:num>
+                <m:r>
+                  <m:rPr>
+                    <m:sty m:val="p"/>
+                  </m:rPr>
+                  <w:rPr>
+                    <w:rFonts w:ascii="Cambria Math" w:hAnsi="Cambria Math"/>
+                    <w:sz w:val="28"/>
+                    <w:szCs w:val="28"/>
+                  </w:rPr>
+                  <m:t xml:space="preserve">20 000+5000+8×20</m:t>
+                </m:r>
+              </m:num>
+              <m:den>
+                <m:r>
+                  <m:rPr>
+                    <m:sty m:val="p"/>
+                  </m:rPr>
+                  <w:rPr>
+                    <w:rFonts w:ascii="Cambria Math" w:hAnsi="Cambria Math"/>
+                    <w:sz w:val="28"/>
+                    <w:szCs w:val="28"/>
+                  </w:rPr>
+                  <m:t xml:space="preserve">28 800</m:t>
+                </m:r>
+              </m:den>
+            </m:f>
+            <m:r>
+              <m:rPr>
+                <m:sty m:val="p"/>
+              </m:rPr>
+              <w:rPr>
+                <w:rFonts w:ascii="Cambria Math" w:hAnsi="Cambria Math"/>
+                <w:sz w:val="28"/>
+                <w:szCs w:val="28"/>
+              </w:rPr>
+              <m:t xml:space="preserve">≈0,87 запросов/с</m:t>
+            </m:r>
+          </m:e>
+        </m:eqArr>
+      </m:oMath>
+      <w:r>
+        <w:tab/>
+        <w:t>(4)</w:t>
+      </w:r>
+    </w:p>
+    <w:p>
+      <w:pPr>
+        <w:tabs>
+          <w:tab w:val="center" w:pos="4819"/>
+          <w:tab w:val="right" w:pos="9638"/>
+        </w:tabs>
+        <w:spacing w:before="0" w:after="0"/>
+      </w:pPr>
+      <w:r>
+        <w:tab/>
+      </w:r>
+      <m:oMath>
+        <m:sSub>
+          <m:e>
+            <m:r>
+              <m:rPr>
+                <m:sty m:val="p"/>
+              </m:rPr>
+              <w:rPr>
+                <w:rFonts w:ascii="Cambria Math" w:hAnsi="Cambria Math"/>
+                <w:sz w:val="28"/>
+                <w:szCs w:val="28"/>
+              </w:rPr>
+              <m:t xml:space="preserve">N</m:t>
+            </m:r>
+          </m:e>
+          <m:sub>
+            <m:r>
+              <m:rPr>
+                <m:sty m:val="p"/>
+              </m:rPr>
+              <w:rPr>
+                <w:rFonts w:ascii="Cambria Math" w:hAnsi="Cambria Math"/>
+                <w:sz w:val="28"/>
+                <w:szCs w:val="28"/>
+              </w:rPr>
+              <m:t xml:space="preserve">cores</m:t>
+            </m:r>
+          </m:sub>
+        </m:sSub>
+        <m:r>
+          <m:rPr>
+            <m:sty m:val="p"/>
+          </m:rPr>
+          <w:rPr>
+            <w:rFonts w:ascii="Cambria Math" w:hAnsi="Cambria Math"/>
+            <w:sz w:val="28"/>
+            <w:szCs w:val="28"/>
+          </w:rPr>
+          <m:t xml:space="preserve">=</m:t>
+        </m:r>
+        <m:f>
+          <m:num>
+            <m:r>
+              <m:rPr>
+                <m:sty m:val="p"/>
+              </m:rPr>
+              <w:rPr>
+                <w:rFonts w:ascii="Cambria Math" w:hAnsi="Cambria Math"/>
+                <w:sz w:val="28"/>
+                <w:szCs w:val="28"/>
+              </w:rPr>
+              <m:t xml:space="preserve">RPS</m:t>
+            </m:r>
+          </m:num>
+          <m:den>
+            <m:sSub>
+              <m:e>
+                <m:r>
+                  <m:rPr>
+                    <m:sty m:val="p"/>
+                  </m:rPr>
+                  <w:rPr>
+                    <w:rFonts w:ascii="Cambria Math" w:hAnsi="Cambria Math"/>
+                    <w:sz w:val="28"/>
+                    <w:szCs w:val="28"/>
+                  </w:rPr>
+                  <m:t xml:space="preserve">RPS</m:t>
+                </m:r>
+              </m:e>
+              <m:sub>
+                <m:r>
+                  <m:rPr>
+                    <m:sty m:val="p"/>
+                  </m:rPr>
+                  <w:rPr>
+                    <w:rFonts w:ascii="Cambria Math" w:hAnsi="Cambria Math"/>
+                    <w:sz w:val="28"/>
+                    <w:szCs w:val="28"/>
+                  </w:rPr>
+                  <m:t xml:space="preserve">core</m:t>
+                </m:r>
+              </m:sub>
+            </m:sSub>
+          </m:den>
+        </m:f>
+        <m:r>
+          <m:rPr>
+            <m:sty m:val="p"/>
+          </m:rPr>
+          <w:rPr>
+            <w:rFonts w:ascii="Cambria Math" w:hAnsi="Cambria Math"/>
+            <w:sz w:val="28"/>
+            <w:szCs w:val="28"/>
+          </w:rPr>
+          <m:t xml:space="preserve">×</m:t>
+        </m:r>
+        <m:sSub>
+          <m:e>
+            <m:r>
+              <m:rPr>
+                <m:sty m:val="p"/>
+              </m:rPr>
+              <w:rPr>
+                <w:rFonts w:ascii="Cambria Math" w:hAnsi="Cambria Math"/>
+                <w:sz w:val="28"/>
+                <w:szCs w:val="28"/>
+              </w:rPr>
+              <m:t xml:space="preserve">k</m:t>
+            </m:r>
+          </m:e>
+          <m:sub>
+            <m:r>
+              <m:rPr>
+                <m:sty m:val="p"/>
+              </m:rPr>
+              <w:rPr>
+                <w:rFonts w:ascii="Cambria Math" w:hAnsi="Cambria Math"/>
+                <w:sz w:val="28"/>
+                <w:szCs w:val="28"/>
+              </w:rPr>
+              <m:t xml:space="preserve">reserve</m:t>
+            </m:r>
+          </m:sub>
+        </m:sSub>
+        <m:r>
+          <m:rPr>
+            <m:sty m:val="p"/>
+          </m:rPr>
+          <w:rPr>
+            <w:rFonts w:ascii="Cambria Math" w:hAnsi="Cambria Math"/>
+            <w:sz w:val="28"/>
+            <w:szCs w:val="28"/>
+          </w:rPr>
+          <m:t xml:space="preserve">=</m:t>
+        </m:r>
+        <m:f>
+          <m:num>
+            <m:r>
+              <m:rPr>
+                <m:sty m:val="p"/>
+              </m:rPr>
+              <w:rPr>
+                <w:rFonts w:ascii="Cambria Math" w:hAnsi="Cambria Math"/>
+                <w:sz w:val="28"/>
+                <w:szCs w:val="28"/>
+              </w:rPr>
+              <m:t xml:space="preserve">0,87</m:t>
+            </m:r>
+          </m:num>
+          <m:den>
+            <m:r>
+              <m:rPr>
+                <m:sty m:val="p"/>
+              </m:rPr>
+              <w:rPr>
+                <w:rFonts w:ascii="Cambria Math" w:hAnsi="Cambria Math"/>
+                <w:sz w:val="28"/>
+                <w:szCs w:val="28"/>
+              </w:rPr>
+              <m:t xml:space="preserve">500</m:t>
+            </m:r>
+          </m:den>
+        </m:f>
+        <m:r>
+          <m:rPr>
+            <m:sty m:val="p"/>
+          </m:rPr>
+          <w:rPr>
+            <w:rFonts w:ascii="Cambria Math" w:hAnsi="Cambria Math"/>
+            <w:sz w:val="28"/>
+            <w:szCs w:val="28"/>
+          </w:rPr>
+          <m:t xml:space="preserve">×1,5≈0,003→1 ядро</m:t>
+        </m:r>
+      </m:oMath>
+      <w:r>
+        <w:tab/>
+        <w:t>(5)</w:t>
+      </w:r>
+    </w:p>
+    <w:p>
+      <w:pPr>
+        <w:tabs>
+          <w:tab w:val="center" w:pos="4819"/>
+          <w:tab w:val="right" w:pos="9638"/>
+        </w:tabs>
+        <w:spacing w:before="0" w:after="0"/>
+      </w:pPr>
+      <w:r>
+        <w:tab/>
+      </w:r>
+      <m:oMath>
+        <m:r>
+          <m:rPr>
+            <m:sty m:val="p"/>
+          </m:rPr>
+          <w:rPr>
+            <w:rFonts w:ascii="Cambria Math" w:hAnsi="Cambria Math"/>
+            <w:sz w:val="28"/>
+            <w:szCs w:val="28"/>
+          </w:rPr>
+          <m:t xml:space="preserve">RAM=4×</m:t>
+        </m:r>
+        <m:sSub>
+          <m:e>
+            <m:r>
+              <m:rPr>
+                <m:sty m:val="p"/>
+              </m:rPr>
+              <w:rPr>
+                <w:rFonts w:ascii="Cambria Math" w:hAnsi="Cambria Math"/>
+                <w:sz w:val="28"/>
+                <w:szCs w:val="28"/>
+              </w:rPr>
+              <m:t xml:space="preserve">N</m:t>
+            </m:r>
+          </m:e>
+          <m:sub>
+            <m:r>
+              <m:rPr>
+                <m:sty m:val="p"/>
+              </m:rPr>
+              <w:rPr>
+                <w:rFonts w:ascii="Cambria Math" w:hAnsi="Cambria Math"/>
+                <w:sz w:val="28"/>
+                <w:szCs w:val="28"/>
+              </w:rPr>
+              <m:t xml:space="preserve">cores</m:t>
+            </m:r>
+          </m:sub>
+        </m:sSub>
+        <m:r>
+          <m:rPr>
+            <m:sty m:val="p"/>
+          </m:rPr>
+          <w:rPr>
+            <w:rFonts w:ascii="Cambria Math" w:hAnsi="Cambria Math"/>
+            <w:sz w:val="28"/>
+            <w:szCs w:val="28"/>
+          </w:rPr>
+          <m:t xml:space="preserve">=4×1=4 ГБ</m:t>
+        </m:r>
+      </m:oMath>
+      <w:r>
+        <w:tab/>
+        <w:t>(6)</w:t>
+      </w:r>
+    </w:p>
+    <w:p>
+      <w:pPr>
+        <w:spacing w:line="360" w:lineRule="auto"/>
+        <w:ind w:firstLine="709"/>
+        <w:jc w:val="both"/>
+      </w:pPr>
+      <w:r>
+        <w:t xml:space="preserve">Типы полей приведены в таблицах 1 и 2, размеры полей и объектов MinIO – в таблице 4. Размеры записей, прирост БД и MinIO за год и диск на 5 лет с запасом </w:t>
+      </w:r>
+      <w:r>
+        <w:t xml:space="preserve">N</w:t>
+      </w:r>
+      <w:r>
+        <w:rPr>
+          <w:vertAlign w:val="subscript"/>
+        </w:rPr>
+        <w:t xml:space="preserve">reserve</w:t>
+      </w:r>
+      <w:r>
+        <w:t xml:space="preserve"> = 10 ГБ – по формулам (7)⁠–⁠(12).</w:t>
+      </w:r>
+    </w:p>
+    <w:p>
+      <w:pPr>
+        <w:keepNext/>
+        <w:spacing w:before="120" w:line="360" w:lineRule="auto"/>
+      </w:pPr>
+      <w:r>
+        <w:t>Таблица 4 – Размеры полей таблиц команд RISC-V и объектов MinIO</w:t>
+      </w:r>
+    </w:p>
+    <w:tbl>
+      <w:tblPr>
+        <w:tblW w:w="9638" w:type="dxa"/>
+        <w:tblBorders>
+          <w:top w:val="single" w:sz="4" w:space="0" w:color="000000"/>
+          <w:left w:val="single" w:sz="4" w:space="0" w:color="000000"/>
+          <w:bottom w:val="single" w:sz="4" w:space="0" w:color="000000"/>
+          <w:right w:val="single" w:sz="4" w:space="0" w:color="000000"/>
+          <w:insideH w:val="single" w:sz="4" w:space="0" w:color="000000"/>
+          <w:insideV w:val="single" w:sz="4" w:space="0" w:color="000000"/>
+        </w:tblBorders>
+        <w:tblCellMar>
+          <w:left w:w="10" w:type="dxa"/>
+          <w:right w:w="10" w:type="dxa"/>
+        </w:tblCellMar>
+        <w:tblLook w:val="0000"/>
+      </w:tblPr>
+      <w:tblGrid>
+        <w:gridCol w:w="2400"/>
+        <w:gridCol w:w="5038"/>
+        <w:gridCol w:w="2200"/>
+      </w:tblGrid>
+      <w:tr>
+        <w:trPr>
+          <w:tblHeader/>
+        </w:trPr>
+        <w:tc>
+          <w:tcPr>
+            <w:tcW w:w="2400" w:type="dxa"/>
+            <w:tcMar>
+              <w:top w:w="40" w:type="dxa"/>
+              <w:left w:w="80" w:type="dxa"/>
+              <w:bottom w:w="40" w:type="dxa"/>
+              <w:right w:w="80" w:type="dxa"/>
+            </w:tcMar>
+          </w:tcPr>
+          <w:p>
+            <w:pPr>
+              <w:keepNext/>
+              <w:jc w:val="center"/>
+            </w:pPr>
+            <w:r>
+              <w:rPr>
+                <w:b/>
+                <w:bCs/>
+                <w:sz w:val="24"/>
+                <w:szCs w:val="24"/>
+              </w:rPr>
+              <w:t xml:space="preserve">Таблица или хранилище</w:t>
+            </w:r>
+          </w:p>
+        </w:tc>
+        <w:tc>
+          <w:tcPr>
+            <w:tcW w:w="5038" w:type="dxa"/>
+            <w:tcMar>
+              <w:top w:w="40" w:type="dxa"/>
+              <w:left w:w="80" w:type="dxa"/>
+              <w:bottom w:w="40" w:type="dxa"/>
+              <w:right w:w="80" w:type="dxa"/>
+            </w:tcMar>
+          </w:tcPr>
+          <w:p>
+            <w:pPr>
+              <w:keepNext/>
+              <w:jc w:val="center"/>
+            </w:pPr>
+            <w:r>
+              <w:rPr>
+                <w:b/>
+                <w:bCs/>
+                <w:sz w:val="24"/>
+                <w:szCs w:val="24"/>
+              </w:rPr>
+              <w:t xml:space="preserve">Поле или объект</w:t>
+            </w:r>
+          </w:p>
+        </w:tc>
+        <w:tc>
+          <w:tcPr>
+            <w:tcW w:w="2200" w:type="dxa"/>
+            <w:tcMar>
+              <w:top w:w="40" w:type="dxa"/>
+              <w:left w:w="80" w:type="dxa"/>
+              <w:bottom w:w="40" w:type="dxa"/>
+              <w:right w:w="80" w:type="dxa"/>
+            </w:tcMar>
+          </w:tcPr>
+          <w:p>
+            <w:pPr>
+              <w:keepNext/>
+              <w:jc w:val="center"/>
+            </w:pPr>
+            <w:r>
+              <w:rPr>
+                <w:b/>
+                <w:bCs/>
+                <w:sz w:val="24"/>
+                <w:szCs w:val="24"/>
+              </w:rPr>
+              <w:t xml:space="preserve">Размер, байт</w:t>
+            </w:r>
+          </w:p>
+        </w:tc>
+      </w:tr>
+      <w:tr>
+        <w:trPr>
+          <w:cantSplit/>
+        </w:trPr>
+        <w:tc>
+          <w:tcPr>
+            <w:tcW w:w="2400" w:type="dxa"/>
+            <w:vMerge w:val="restart"/>
+            <w:tcMar>
+              <w:top w:w="40" w:type="dxa"/>
+              <w:left w:w="80" w:type="dxa"/>
+              <w:bottom w:w="40" w:type="dxa"/>
+              <w:right w:w="80" w:type="dxa"/>
+            </w:tcMar>
+          </w:tcPr>
+          <w:p>
+            <w:pPr>
+              <w:keepNext/>
+            </w:pPr>
+            <w:r>
+              <w:rPr>
+                <w:sz w:val="24"/>
+                <w:szCs w:val="24"/>
+              </w:rPr>
+              <w:t xml:space="preserve">riscv_commands</w:t>
+            </w:r>
+          </w:p>
+        </w:tc>
+        <w:tc>
+          <w:tcPr>
+            <w:tcW w:w="5038" w:type="dxa"/>
+            <w:tcMar>
+              <w:top w:w="40" w:type="dxa"/>
+              <w:left w:w="80" w:type="dxa"/>
+              <w:bottom w:w="40" w:type="dxa"/>
+              <w:right w:w="80" w:type="dxa"/>
+            </w:tcMar>
+          </w:tcPr>
+          <w:p>
+            <w:pPr>
+              <w:keepNext/>
+            </w:pPr>
+            <w:r>
+              <w:rPr>
+                <w:sz w:val="24"/>
+                <w:szCs w:val="24"/>
+              </w:rPr>
+              <w:t xml:space="preserve">id, creator_id, created_at, published_at</w:t>
+            </w:r>
+          </w:p>
+        </w:tc>
+        <w:tc>
+          <w:tcPr>
+            <w:tcW w:w="2200" w:type="dxa"/>
+            <w:tcMar>
+              <w:top w:w="40" w:type="dxa"/>
+              <w:left w:w="80" w:type="dxa"/>
+              <w:bottom w:w="40" w:type="dxa"/>
+              <w:right w:w="80" w:type="dxa"/>
+            </w:tcMar>
+          </w:tcPr>
+          <w:p>
+            <w:pPr>
+              <w:keepNext/>
+              <w:jc w:val="center"/>
+            </w:pPr>
+            <w:r>
+              <w:rPr>
+                <w:sz w:val="24"/>
+                <w:szCs w:val="24"/>
+              </w:rPr>
+              <w:t xml:space="preserve">8</w:t>
+            </w:r>
+          </w:p>
+        </w:tc>
+      </w:tr>
+      <w:tr>
+        <w:trPr>
+          <w:cantSplit/>
+        </w:trPr>
+        <w:tc>
+          <w:tcPr>
+            <w:tcW w:w="2400" w:type="dxa"/>
+            <w:vMerge/>
+            <w:tcMar>
+              <w:top w:w="40" w:type="dxa"/>
+              <w:left w:w="80" w:type="dxa"/>
+              <w:bottom w:w="40" w:type="dxa"/>
+              <w:right w:w="80" w:type="dxa"/>
+            </w:tcMar>
+          </w:tcPr>
+          <w:p>
+            <w:pPr>
+              <w:keepNext/>
+            </w:pPr>
+          </w:p>
+        </w:tc>
+        <w:tc>
+          <w:tcPr>
+            <w:tcW w:w="5038" w:type="dxa"/>
+            <w:tcMar>
+              <w:top w:w="40" w:type="dxa"/>
+              <w:left w:w="80" w:type="dxa"/>
+              <w:bottom w:w="40" w:type="dxa"/>
+              <w:right w:w="80" w:type="dxa"/>
+            </w:tcMar>
+          </w:tcPr>
+          <w:p>
+            <w:pPr>
+              <w:keepNext/>
+            </w:pPr>
+            <w:r>
+              <w:rPr>
+                <w:sz w:val="24"/>
+                <w:szCs w:val="24"/>
+              </w:rPr>
+              <w:t xml:space="preserve">mnemonic, status</w:t>
+            </w:r>
+          </w:p>
+        </w:tc>
+        <w:tc>
+          <w:tcPr>
+            <w:tcW w:w="2200" w:type="dxa"/>
+            <w:tcMar>
+              <w:top w:w="40" w:type="dxa"/>
+              <w:left w:w="80" w:type="dxa"/>
+              <w:bottom w:w="40" w:type="dxa"/>
+              <w:right w:w="80" w:type="dxa"/>
+            </w:tcMar>
+          </w:tcPr>
+          <w:p>
+            <w:pPr>
+              <w:keepNext/>
+              <w:jc w:val="center"/>
+            </w:pPr>
+            <w:r>
+              <w:rPr>
+                <w:sz w:val="24"/>
+                <w:szCs w:val="24"/>
+              </w:rPr>
+              <w:t xml:space="preserve">16</w:t>
+            </w:r>
+          </w:p>
+        </w:tc>
+      </w:tr>
+      <w:tr>
+        <w:trPr>
+          <w:cantSplit/>
+        </w:trPr>
+        <w:tc>
+          <w:tcPr>
+            <w:tcW w:w="2400" w:type="dxa"/>
+            <w:vMerge/>
+            <w:tcMar>
+              <w:top w:w="40" w:type="dxa"/>
+              <w:left w:w="80" w:type="dxa"/>
+              <w:bottom w:w="40" w:type="dxa"/>
+              <w:right w:w="80" w:type="dxa"/>
+            </w:tcMar>
+          </w:tcPr>
+          <w:p>
+            <w:pPr>
+              <w:keepNext/>
+            </w:pPr>
+          </w:p>
+        </w:tc>
+        <w:tc>
+          <w:tcPr>
+            <w:tcW w:w="5038" w:type="dxa"/>
+            <w:tcMar>
+              <w:top w:w="40" w:type="dxa"/>
+              <w:left w:w="80" w:type="dxa"/>
+              <w:bottom w:w="40" w:type="dxa"/>
+              <w:right w:w="80" w:type="dxa"/>
+            </w:tcMar>
+          </w:tcPr>
+          <w:p>
+            <w:pPr>
+              <w:keepNext/>
+            </w:pPr>
+            <w:r>
+              <w:rPr>
+                <w:sz w:val="24"/>
+                <w:szCs w:val="24"/>
+              </w:rPr>
+              <w:t xml:space="preserve">description</w:t>
+            </w:r>
+          </w:p>
+        </w:tc>
+        <w:tc>
+          <w:tcPr>
+            <w:tcW w:w="2200" w:type="dxa"/>
+            <w:tcMar>
+              <w:top w:w="40" w:type="dxa"/>
+              <w:left w:w="80" w:type="dxa"/>
+              <w:bottom w:w="40" w:type="dxa"/>
+              <w:right w:w="80" w:type="dxa"/>
+            </w:tcMar>
+          </w:tcPr>
+          <w:p>
+            <w:pPr>
+              <w:keepNext/>
+              <w:jc w:val="center"/>
+            </w:pPr>
+            <w:r>
+              <w:rPr>
+                <w:sz w:val="24"/>
+                <w:szCs w:val="24"/>
+              </w:rPr>
+              <w:t xml:space="preserve">1000</w:t>
+            </w:r>
+          </w:p>
+        </w:tc>
+      </w:tr>
+      <w:tr>
+        <w:trPr>
+          <w:cantSplit/>
+        </w:trPr>
+        <w:tc>
+          <w:tcPr>
+            <w:tcW w:w="2400" w:type="dxa"/>
+            <w:vMerge/>
+            <w:tcMar>
+              <w:top w:w="40" w:type="dxa"/>
+              <w:left w:w="80" w:type="dxa"/>
+              <w:bottom w:w="40" w:type="dxa"/>
+              <w:right w:w="80" w:type="dxa"/>
+            </w:tcMar>
+          </w:tcPr>
+          <w:p>
+            <w:pPr>
+              <w:keepNext/>
+            </w:pPr>
+          </w:p>
+        </w:tc>
+        <w:tc>
+          <w:tcPr>
+            <w:tcW w:w="5038" w:type="dxa"/>
+            <w:tcMar>
+              <w:top w:w="40" w:type="dxa"/>
+              <w:left w:w="80" w:type="dxa"/>
+              <w:bottom w:w="40" w:type="dxa"/>
+              <w:right w:w="80" w:type="dxa"/>
+            </w:tcMar>
+          </w:tcPr>
+          <w:p>
+            <w:pPr>
+              <w:keepNext/>
+            </w:pPr>
+            <w:r>
+              <w:rPr>
+                <w:sz w:val="24"/>
+                <w:szCs w:val="24"/>
+              </w:rPr>
+              <w:t xml:space="preserve">operand_count, length_bits</w:t>
+            </w:r>
+          </w:p>
+        </w:tc>
+        <w:tc>
+          <w:tcPr>
+            <w:tcW w:w="2200" w:type="dxa"/>
+            <w:tcMar>
+              <w:top w:w="40" w:type="dxa"/>
+              <w:left w:w="80" w:type="dxa"/>
+              <w:bottom w:w="40" w:type="dxa"/>
+              <w:right w:w="80" w:type="dxa"/>
+            </w:tcMar>
+          </w:tcPr>
+          <w:p>
+            <w:pPr>
+              <w:keepNext/>
+              <w:jc w:val="center"/>
+            </w:pPr>
+            <w:r>
+              <w:rPr>
+                <w:sz w:val="24"/>
+                <w:szCs w:val="24"/>
+              </w:rPr>
+              <w:t xml:space="preserve">2</w:t>
+            </w:r>
+          </w:p>
+        </w:tc>
+      </w:tr>
+      <w:tr>
+        <w:trPr>
+          <w:cantSplit/>
+        </w:trPr>
+        <w:tc>
+          <w:tcPr>
+            <w:tcW w:w="2400" w:type="dxa"/>
+            <w:vMerge/>
+            <w:tcMar>
+              <w:top w:w="40" w:type="dxa"/>
+              <w:left w:w="80" w:type="dxa"/>
+              <w:bottom w:w="40" w:type="dxa"/>
+              <w:right w:w="80" w:type="dxa"/>
+            </w:tcMar>
+          </w:tcPr>
+          <w:p>
+            <w:pPr>
+              <w:keepNext/>
+            </w:pPr>
+          </w:p>
+        </w:tc>
+        <w:tc>
+          <w:tcPr>
+            <w:tcW w:w="5038" w:type="dxa"/>
+            <w:tcMar>
+              <w:top w:w="40" w:type="dxa"/>
+              <w:left w:w="80" w:type="dxa"/>
+              <w:bottom w:w="40" w:type="dxa"/>
+              <w:right w:w="80" w:type="dxa"/>
+            </w:tcMar>
+          </w:tcPr>
+          <w:p>
+            <w:pPr>
+              <w:keepNext/>
+            </w:pPr>
+            <w:r>
+              <w:rPr>
+                <w:sz w:val="24"/>
+                <w:szCs w:val="24"/>
+              </w:rPr>
+              <w:t xml:space="preserve">image_key, video_key</w:t>
+            </w:r>
+          </w:p>
+        </w:tc>
+        <w:tc>
+          <w:tcPr>
+            <w:tcW w:w="2200" w:type="dxa"/>
+            <w:tcMar>
+              <w:top w:w="40" w:type="dxa"/>
+              <w:left w:w="80" w:type="dxa"/>
+              <w:bottom w:w="40" w:type="dxa"/>
+              <w:right w:w="80" w:type="dxa"/>
+            </w:tcMar>
+          </w:tcPr>
+          <w:p>
+            <w:pPr>
+              <w:keepNext/>
+              <w:jc w:val="center"/>
+            </w:pPr>
+            <w:r>
+              <w:rPr>
+                <w:sz w:val="24"/>
+                <w:szCs w:val="24"/>
+              </w:rPr>
+              <w:t xml:space="preserve">255</w:t>
+            </w:r>
+          </w:p>
+        </w:tc>
+      </w:tr>
+      <w:tr>
+        <w:trPr>
+          <w:cantSplit/>
+        </w:trPr>
+        <w:tc>
+          <w:tcPr>
+            <w:tcW w:w="2400" w:type="dxa"/>
+            <w:tcMar>
+              <w:top w:w="40" w:type="dxa"/>
+              <w:left w:w="80" w:type="dxa"/>
+              <w:bottom w:w="40" w:type="dxa"/>
+              <w:right w:w="80" w:type="dxa"/>
+            </w:tcMar>
+          </w:tcPr>
+          <w:p>
+            <w:pPr>
+              <w:keepNext/>
+            </w:pPr>
+            <w:r>
+              <w:rPr>
+                <w:sz w:val="24"/>
+                <w:szCs w:val="24"/>
+              </w:rPr>
+              <w:t xml:space="preserve">riscv_command_likes</w:t>
+            </w:r>
+          </w:p>
+        </w:tc>
+        <w:tc>
+          <w:tcPr>
+            <w:tcW w:w="5038" w:type="dxa"/>
+            <w:tcMar>
+              <w:top w:w="40" w:type="dxa"/>
+              <w:left w:w="80" w:type="dxa"/>
+              <w:bottom w:w="40" w:type="dxa"/>
+              <w:right w:w="80" w:type="dxa"/>
+            </w:tcMar>
+          </w:tcPr>
+          <w:p>
+            <w:pPr>
+              <w:keepNext/>
+            </w:pPr>
+            <w:r>
+              <w:rPr>
+                <w:sz w:val="24"/>
+                <w:szCs w:val="24"/>
+              </w:rPr>
+              <w:t xml:space="preserve">id, user_id, riscv_command_id</w:t>
+            </w:r>
+          </w:p>
+        </w:tc>
+        <w:tc>
+          <w:tcPr>
+            <w:tcW w:w="2200" w:type="dxa"/>
+            <w:tcMar>
+              <w:top w:w="40" w:type="dxa"/>
+              <w:left w:w="80" w:type="dxa"/>
+              <w:bottom w:w="40" w:type="dxa"/>
+              <w:right w:w="80" w:type="dxa"/>
+            </w:tcMar>
+          </w:tcPr>
+          <w:p>
+            <w:pPr>
+              <w:keepNext/>
+              <w:jc w:val="center"/>
+            </w:pPr>
+            <w:r>
+              <w:rPr>
+                <w:sz w:val="24"/>
+                <w:szCs w:val="24"/>
+              </w:rPr>
+              <w:t xml:space="preserve">8</w:t>
+            </w:r>
+          </w:p>
+        </w:tc>
+      </w:tr>
+      <w:tr>
+        <w:trPr>
+          <w:cantSplit/>
+        </w:trPr>
+        <w:tc>
+          <w:tcPr>
+            <w:tcW w:w="2400" w:type="dxa"/>
+            <w:vMerge w:val="restart"/>
+            <w:tcMar>
+              <w:top w:w="40" w:type="dxa"/>
+              <w:left w:w="80" w:type="dxa"/>
+              <w:bottom w:w="40" w:type="dxa"/>
+              <w:right w:w="80" w:type="dxa"/>
+            </w:tcMar>
+          </w:tcPr>
+          <w:p>
+            <w:pPr>
+              <w:keepNext/>
+            </w:pPr>
+            <w:r>
+              <w:rPr>
+                <w:sz w:val="24"/>
+                <w:szCs w:val="24"/>
+              </w:rPr>
+              <w:t xml:space="preserve">MinIO</w:t>
+            </w:r>
+          </w:p>
+        </w:tc>
+        <w:tc>
+          <w:tcPr>
+            <w:tcW w:w="5038" w:type="dxa"/>
+            <w:tcMar>
+              <w:top w:w="40" w:type="dxa"/>
+              <w:left w:w="80" w:type="dxa"/>
+              <w:bottom w:w="40" w:type="dxa"/>
+              <w:right w:w="80" w:type="dxa"/>
+            </w:tcMar>
+          </w:tcPr>
+          <w:p>
+            <w:pPr>
+              <w:keepNext/>
+            </w:pPr>
+            <w:r>
+              <w:rPr>
+                <w:sz w:val="24"/>
+                <w:szCs w:val="24"/>
+              </w:rPr>
+              <w:t xml:space="preserve">изображение команды (PNG)</w:t>
+            </w:r>
+          </w:p>
+        </w:tc>
+        <w:tc>
+          <w:tcPr>
+            <w:tcW w:w="2200" w:type="dxa"/>
+            <w:tcMar>
+              <w:top w:w="40" w:type="dxa"/>
+              <w:left w:w="80" w:type="dxa"/>
+              <w:bottom w:w="40" w:type="dxa"/>
+              <w:right w:w="80" w:type="dxa"/>
+            </w:tcMar>
+          </w:tcPr>
+          <w:p>
+            <w:pPr>
+              <w:keepNext/>
+              <w:jc w:val="center"/>
+            </w:pPr>
+            <w:r>
+              <w:rPr>
+                <w:sz w:val="24"/>
+                <w:szCs w:val="24"/>
+              </w:rPr>
+              <w:t xml:space="preserve">771 758</w:t>
+            </w:r>
+          </w:p>
+        </w:tc>
+      </w:tr>
+      <w:tr>
+        <w:trPr>
+          <w:cantSplit/>
+        </w:trPr>
+        <w:tc>
+          <w:tcPr>
+            <w:tcW w:w="2400" w:type="dxa"/>
+            <w:vMerge/>
+            <w:tcMar>
+              <w:top w:w="40" w:type="dxa"/>
+              <w:left w:w="80" w:type="dxa"/>
+              <w:bottom w:w="40" w:type="dxa"/>
+              <w:right w:w="80" w:type="dxa"/>
+            </w:tcMar>
+          </w:tcPr>
+          <w:p>
+            <w:pPr>
+              <w:keepNext/>
+            </w:pPr>
+          </w:p>
+        </w:tc>
+        <w:tc>
+          <w:tcPr>
+            <w:tcW w:w="5038" w:type="dxa"/>
+            <w:tcMar>
+              <w:top w:w="40" w:type="dxa"/>
+              <w:left w:w="80" w:type="dxa"/>
+              <w:bottom w:w="40" w:type="dxa"/>
+              <w:right w:w="80" w:type="dxa"/>
+            </w:tcMar>
+          </w:tcPr>
+          <w:p>
+            <w:pPr>
+              <w:keepNext/>
+            </w:pPr>
+            <w:r>
+              <w:rPr>
+                <w:sz w:val="24"/>
+                <w:szCs w:val="24"/>
+              </w:rPr>
+              <w:t xml:space="preserve">видео команды (MP4)</w:t>
+            </w:r>
+          </w:p>
+        </w:tc>
+        <w:tc>
+          <w:tcPr>
+            <w:tcW w:w="2200" w:type="dxa"/>
+            <w:tcMar>
+              <w:top w:w="40" w:type="dxa"/>
+              <w:left w:w="80" w:type="dxa"/>
+              <w:bottom w:w="40" w:type="dxa"/>
+              <w:right w:w="80" w:type="dxa"/>
+            </w:tcMar>
+          </w:tcPr>
+          <w:p>
+            <w:pPr>
+              <w:keepNext/>
+              <w:jc w:val="center"/>
+            </w:pPr>
+            <w:r>
+              <w:rPr>
+                <w:sz w:val="24"/>
+                <w:szCs w:val="24"/>
+              </w:rPr>
+              <w:t xml:space="preserve">27 249</w:t>
+            </w:r>
+          </w:p>
+        </w:tc>
+      </w:tr>
+    </w:tbl>
+    <w:p>
+      <w:pPr>
+        <w:tabs>
+          <w:tab w:val="center" w:pos="4819"/>
+          <w:tab w:val="right" w:pos="9638"/>
+        </w:tabs>
+        <w:spacing w:before="0" w:after="0"/>
+      </w:pPr>
+      <w:r>
+        <w:tab/>
+      </w:r>
+      <m:oMath>
+        <m:sSub>
+          <m:e>
+            <m:r>
+              <m:rPr>
+                <m:sty m:val="p"/>
+              </m:rPr>
+              <w:rPr>
+                <w:rFonts w:ascii="Cambria Math" w:hAnsi="Cambria Math"/>
+                <w:sz w:val="28"/>
+                <w:szCs w:val="28"/>
+              </w:rPr>
+              <m:t xml:space="preserve">S</m:t>
+            </m:r>
+          </m:e>
+          <m:sub>
+            <m:r>
+              <m:rPr>
+                <m:sty m:val="p"/>
+              </m:rPr>
+              <w:rPr>
+                <w:rFonts w:ascii="Cambria Math" w:hAnsi="Cambria Math"/>
+                <w:sz w:val="28"/>
+                <w:szCs w:val="28"/>
+              </w:rPr>
+              <m:t xml:space="preserve">command</m:t>
+            </m:r>
+          </m:sub>
+        </m:sSub>
+        <m:r>
+          <m:rPr>
+            <m:sty m:val="p"/>
+          </m:rPr>
+          <w:rPr>
+            <w:rFonts w:ascii="Cambria Math" w:hAnsi="Cambria Math"/>
+            <w:sz w:val="28"/>
+            <w:szCs w:val="28"/>
+          </w:rPr>
+          <m:t xml:space="preserve">=8×4+16×2+1000+2×2+255×2=1578 байт</m:t>
+        </m:r>
+      </m:oMath>
+      <w:r>
+        <w:tab/>
+        <w:t>(7)</w:t>
+      </w:r>
+    </w:p>
+    <w:p>
+      <w:pPr>
+        <w:tabs>
+          <w:tab w:val="center" w:pos="4819"/>
+          <w:tab w:val="right" w:pos="9638"/>
+        </w:tabs>
+        <w:spacing w:before="0" w:after="0"/>
+      </w:pPr>
+      <w:r>
+        <w:tab/>
+      </w:r>
+      <m:oMath>
+        <m:sSub>
+          <m:e>
+            <m:r>
+              <m:rPr>
+                <m:sty m:val="p"/>
+              </m:rPr>
+              <w:rPr>
+                <w:rFonts w:ascii="Cambria Math" w:hAnsi="Cambria Math"/>
+                <w:sz w:val="28"/>
+                <w:szCs w:val="28"/>
+              </w:rPr>
+              <m:t xml:space="preserve">S</m:t>
+            </m:r>
+          </m:e>
+          <m:sub>
+            <m:r>
+              <m:rPr>
+                <m:sty m:val="p"/>
+              </m:rPr>
+              <w:rPr>
+                <w:rFonts w:ascii="Cambria Math" w:hAnsi="Cambria Math"/>
+                <w:sz w:val="28"/>
+                <w:szCs w:val="28"/>
+              </w:rPr>
+              <m:t xml:space="preserve">like</m:t>
+            </m:r>
+          </m:sub>
+        </m:sSub>
+        <m:r>
+          <m:rPr>
+            <m:sty m:val="p"/>
+          </m:rPr>
+          <w:rPr>
+            <w:rFonts w:ascii="Cambria Math" w:hAnsi="Cambria Math"/>
+            <w:sz w:val="28"/>
+            <w:szCs w:val="28"/>
+          </w:rPr>
+          <m:t xml:space="preserve">=8×3=24 байта</m:t>
+        </m:r>
+      </m:oMath>
+      <w:r>
+        <w:tab/>
+        <w:t>(8)</w:t>
+      </w:r>
+    </w:p>
+    <w:p>
+      <w:pPr>
+        <w:tabs>
+          <w:tab w:val="center" w:pos="4819"/>
+          <w:tab w:val="right" w:pos="9638"/>
+        </w:tabs>
+        <w:spacing w:before="0" w:after="0"/>
+      </w:pPr>
+      <w:r>
+        <w:tab/>
+      </w:r>
+      <m:oMath>
+        <m:sSub>
+          <m:e>
+            <m:r>
+              <m:rPr>
+                <m:sty m:val="p"/>
+              </m:rPr>
+              <w:rPr>
+                <w:rFonts w:ascii="Cambria Math" w:hAnsi="Cambria Math"/>
+                <w:sz w:val="28"/>
+                <w:szCs w:val="28"/>
+              </w:rPr>
+              <m:t xml:space="preserve">S</m:t>
+            </m:r>
+          </m:e>
+          <m:sub>
+            <m:r>
+              <m:rPr>
+                <m:sty m:val="p"/>
+              </m:rPr>
+              <w:rPr>
+                <w:rFonts w:ascii="Cambria Math" w:hAnsi="Cambria Math"/>
+                <w:sz w:val="28"/>
+                <w:szCs w:val="28"/>
+              </w:rPr>
+              <m:t xml:space="preserve">media</m:t>
+            </m:r>
+          </m:sub>
+        </m:sSub>
+        <m:r>
+          <m:rPr>
+            <m:sty m:val="p"/>
+          </m:rPr>
+          <w:rPr>
+            <w:rFonts w:ascii="Cambria Math" w:hAnsi="Cambria Math"/>
+            <w:sz w:val="28"/>
+            <w:szCs w:val="28"/>
+          </w:rPr>
+          <m:t xml:space="preserve">=771 758+27 249=799 007 байт</m:t>
+        </m:r>
+      </m:oMath>
+      <w:r>
+        <w:tab/>
+        <w:t>(9)</w:t>
+      </w:r>
+    </w:p>
+    <w:p>
+      <w:pPr>
+        <w:tabs>
+          <w:tab w:val="center" w:pos="4819"/>
+          <w:tab w:val="right" w:pos="9638"/>
+        </w:tabs>
+        <w:spacing w:before="0" w:after="0"/>
+      </w:pPr>
+      <w:r>
+        <w:tab/>
+      </w:r>
+      <m:oMath>
+        <m:eqArr>
+          <m:e>
+            <m:sSub>
+              <m:e>
+                <m:r>
+                  <m:rPr>
+                    <m:sty m:val="p"/>
+                  </m:rPr>
+                  <w:rPr>
+                    <w:rFonts w:ascii="Cambria Math" w:hAnsi="Cambria Math"/>
+                    <w:sz w:val="28"/>
+                    <w:szCs w:val="28"/>
+                  </w:rPr>
+                  <m:t xml:space="preserve">DB</m:t>
+                </m:r>
+              </m:e>
+              <m:sub>
+                <m:r>
+                  <m:rPr>
+                    <m:sty m:val="p"/>
+                  </m:rPr>
+                  <w:rPr>
+                    <w:rFonts w:ascii="Cambria Math" w:hAnsi="Cambria Math"/>
+                    <w:sz w:val="28"/>
+                    <w:szCs w:val="28"/>
+                  </w:rPr>
+                  <m:t xml:space="preserve">year</m:t>
+                </m:r>
+              </m:sub>
+            </m:sSub>
+            <m:r>
+              <m:rPr>
+                <m:sty m:val="p"/>
+              </m:rPr>
+              <w:rPr>
+                <w:rFonts w:ascii="Cambria Math" w:hAnsi="Cambria Math"/>
+                <w:sz w:val="28"/>
+                <w:szCs w:val="28"/>
+              </w:rPr>
+              <m:t xml:space="preserve">=</m:t>
+            </m:r>
+            <m:f>
+              <m:num>
+                <m:r>
+                  <m:rPr>
+                    <m:sty m:val="p"/>
+                  </m:rPr>
+                  <w:rPr>
+                    <w:rFonts w:ascii="Cambria Math" w:hAnsi="Cambria Math"/>
+                    <w:sz w:val="28"/>
+                    <w:szCs w:val="28"/>
+                  </w:rPr>
+                  <m:t xml:space="preserve">365×(</m:t>
+                </m:r>
+                <m:sSub>
+                  <m:e>
+                    <m:r>
+                      <m:rPr>
+                        <m:sty m:val="p"/>
+                      </m:rPr>
+                      <w:rPr>
+                        <w:rFonts w:ascii="Cambria Math" w:hAnsi="Cambria Math"/>
+                        <w:sz w:val="28"/>
+                        <w:szCs w:val="28"/>
+                      </w:rPr>
+                      <m:t xml:space="preserve">N</m:t>
+                    </m:r>
+                  </m:e>
+                  <m:sub>
+                    <m:r>
+                      <m:rPr>
+                        <m:sty m:val="p"/>
+                      </m:rPr>
+                      <w:rPr>
+                        <w:rFonts w:ascii="Cambria Math" w:hAnsi="Cambria Math"/>
+                        <w:sz w:val="28"/>
+                        <w:szCs w:val="28"/>
+                      </w:rPr>
+                      <m:t xml:space="preserve">cmd</m:t>
+                    </m:r>
+                  </m:sub>
+                </m:sSub>
+                <m:r>
+                  <m:rPr>
+                    <m:sty m:val="p"/>
+                  </m:rPr>
+                  <w:rPr>
+                    <w:rFonts w:ascii="Cambria Math" w:hAnsi="Cambria Math"/>
+                    <w:sz w:val="28"/>
+                    <w:szCs w:val="28"/>
+                  </w:rPr>
+                  <m:t xml:space="preserve">×</m:t>
+                </m:r>
+                <m:sSub>
+                  <m:e>
+                    <m:r>
+                      <m:rPr>
+                        <m:sty m:val="p"/>
+                      </m:rPr>
+                      <w:rPr>
+                        <w:rFonts w:ascii="Cambria Math" w:hAnsi="Cambria Math"/>
+                        <w:sz w:val="28"/>
+                        <w:szCs w:val="28"/>
+                      </w:rPr>
+                      <m:t xml:space="preserve">S</m:t>
+                    </m:r>
+                  </m:e>
+                  <m:sub>
+                    <m:r>
+                      <m:rPr>
+                        <m:sty m:val="p"/>
+                      </m:rPr>
+                      <w:rPr>
+                        <w:rFonts w:ascii="Cambria Math" w:hAnsi="Cambria Math"/>
+                        <w:sz w:val="28"/>
+                        <w:szCs w:val="28"/>
+                      </w:rPr>
+                      <m:t xml:space="preserve">command</m:t>
+                    </m:r>
+                  </m:sub>
+                </m:sSub>
+                <m:r>
+                  <m:rPr>
+                    <m:sty m:val="p"/>
+                  </m:rPr>
+                  <w:rPr>
+                    <w:rFonts w:ascii="Cambria Math" w:hAnsi="Cambria Math"/>
+                    <w:sz w:val="28"/>
+                    <w:szCs w:val="28"/>
+                  </w:rPr>
+                  <m:t xml:space="preserve">+</m:t>
+                </m:r>
+                <m:sSub>
+                  <m:e>
+                    <m:r>
+                      <m:rPr>
+                        <m:sty m:val="p"/>
+                      </m:rPr>
+                      <w:rPr>
+                        <w:rFonts w:ascii="Cambria Math" w:hAnsi="Cambria Math"/>
+                        <w:sz w:val="28"/>
+                        <w:szCs w:val="28"/>
+                      </w:rPr>
+                      <m:t xml:space="preserve">N</m:t>
+                    </m:r>
+                  </m:e>
+                  <m:sub>
+                    <m:r>
+                      <m:rPr>
+                        <m:sty m:val="p"/>
+                      </m:rPr>
+                      <w:rPr>
+                        <w:rFonts w:ascii="Cambria Math" w:hAnsi="Cambria Math"/>
+                        <w:sz w:val="28"/>
+                        <w:szCs w:val="28"/>
+                      </w:rPr>
+                      <m:t xml:space="preserve">like</m:t>
+                    </m:r>
+                  </m:sub>
+                </m:sSub>
+                <m:r>
+                  <m:rPr>
+                    <m:sty m:val="p"/>
+                  </m:rPr>
+                  <w:rPr>
+                    <w:rFonts w:ascii="Cambria Math" w:hAnsi="Cambria Math"/>
+                    <w:sz w:val="28"/>
+                    <w:szCs w:val="28"/>
+                  </w:rPr>
+                  <m:t xml:space="preserve">×</m:t>
+                </m:r>
+                <m:sSub>
+                  <m:e>
+                    <m:r>
+                      <m:rPr>
+                        <m:sty m:val="p"/>
+                      </m:rPr>
+                      <w:rPr>
+                        <w:rFonts w:ascii="Cambria Math" w:hAnsi="Cambria Math"/>
+                        <w:sz w:val="28"/>
+                        <w:szCs w:val="28"/>
+                      </w:rPr>
+                      <m:t xml:space="preserve">S</m:t>
+                    </m:r>
+                  </m:e>
+                  <m:sub>
+                    <m:r>
+                      <m:rPr>
+                        <m:sty m:val="p"/>
+                      </m:rPr>
+                      <w:rPr>
+                        <w:rFonts w:ascii="Cambria Math" w:hAnsi="Cambria Math"/>
+                        <w:sz w:val="28"/>
+                        <w:szCs w:val="28"/>
+                      </w:rPr>
+                      <m:t xml:space="preserve">like</m:t>
+                    </m:r>
+                  </m:sub>
+                </m:sSub>
+                <m:r>
+                  <m:rPr>
+                    <m:sty m:val="p"/>
+                  </m:rPr>
+                  <w:rPr>
+                    <w:rFonts w:ascii="Cambria Math" w:hAnsi="Cambria Math"/>
+                    <w:sz w:val="28"/>
+                    <w:szCs w:val="28"/>
+                  </w:rPr>
+                  <m:t xml:space="preserve">)</m:t>
+                </m:r>
+              </m:num>
+              <m:den>
+                <m:sSup>
+                  <m:e>
+                    <m:r>
+                      <m:rPr>
+                        <m:sty m:val="p"/>
+                      </m:rPr>
+                      <w:rPr>
+                        <w:rFonts w:ascii="Cambria Math" w:hAnsi="Cambria Math"/>
+                        <w:sz w:val="28"/>
+                        <w:szCs w:val="28"/>
+                      </w:rPr>
+                      <m:t xml:space="preserve">1024</m:t>
+                    </m:r>
+                  </m:e>
+                  <m:sup>
+                    <m:r>
+                      <m:rPr>
+                        <m:sty m:val="p"/>
+                      </m:rPr>
+                      <w:rPr>
+                        <w:rFonts w:ascii="Cambria Math" w:hAnsi="Cambria Math"/>
+                        <w:sz w:val="28"/>
+                        <w:szCs w:val="28"/>
+                      </w:rPr>
+                      <m:t xml:space="preserve">3</m:t>
+                    </m:r>
+                  </m:sup>
+                </m:sSup>
+              </m:den>
+            </m:f>
+            <m:r>
+              <m:rPr>
+                <m:sty m:val="p"/>
+              </m:rPr>
+              <w:rPr>
+                <w:rFonts w:ascii="Cambria Math" w:hAnsi="Cambria Math"/>
+                <w:sz w:val="28"/>
+                <w:szCs w:val="28"/>
+              </w:rPr>
+              <m:t xml:space="preserve">=</m:t>
+            </m:r>
+          </m:e>
+          <m:e>
+            <m:r>
+              <m:rPr>
+                <m:sty m:val="p"/>
+              </m:rPr>
+              <w:rPr>
+                <w:rFonts w:ascii="Cambria Math" w:hAnsi="Cambria Math"/>
+                <w:sz w:val="28"/>
+                <w:szCs w:val="28"/>
+              </w:rPr>
+              <m:t xml:space="preserve">=</m:t>
+            </m:r>
+            <m:f>
+              <m:num>
+                <m:r>
+                  <m:rPr>
+                    <m:sty m:val="p"/>
+                  </m:rPr>
+                  <w:rPr>
+                    <w:rFonts w:ascii="Cambria Math" w:hAnsi="Cambria Math"/>
+                    <w:sz w:val="28"/>
+                    <w:szCs w:val="28"/>
+                  </w:rPr>
+                  <m:t xml:space="preserve">365×(20×1578+5000×24)</m:t>
+                </m:r>
+              </m:num>
+              <m:den>
+                <m:sSup>
+                  <m:e>
+                    <m:r>
+                      <m:rPr>
+                        <m:sty m:val="p"/>
+                      </m:rPr>
+                      <w:rPr>
+                        <w:rFonts w:ascii="Cambria Math" w:hAnsi="Cambria Math"/>
+                        <w:sz w:val="28"/>
+                        <w:szCs w:val="28"/>
+                      </w:rPr>
+                      <m:t xml:space="preserve">1024</m:t>
+                    </m:r>
+                  </m:e>
+                  <m:sup>
+                    <m:r>
+                      <m:rPr>
+                        <m:sty m:val="p"/>
+                      </m:rPr>
+                      <w:rPr>
+                        <w:rFonts w:ascii="Cambria Math" w:hAnsi="Cambria Math"/>
+                        <w:sz w:val="28"/>
+                        <w:szCs w:val="28"/>
+                      </w:rPr>
+                      <m:t xml:space="preserve">3</m:t>
+                    </m:r>
+                  </m:sup>
+                </m:sSup>
+              </m:den>
+            </m:f>
+            <m:r>
+              <m:rPr>
+                <m:sty m:val="p"/>
+              </m:rPr>
+              <w:rPr>
+                <w:rFonts w:ascii="Cambria Math" w:hAnsi="Cambria Math"/>
+                <w:sz w:val="28"/>
+                <w:szCs w:val="28"/>
+              </w:rPr>
+              <m:t xml:space="preserve">≈0,05 ГБ/год</m:t>
+            </m:r>
+          </m:e>
+        </m:eqArr>
+      </m:oMath>
+      <w:r>
+        <w:tab/>
+        <w:t>(10)</w:t>
+      </w:r>
+    </w:p>
+    <w:p>
+      <w:pPr>
+        <w:tabs>
+          <w:tab w:val="center" w:pos="4819"/>
+          <w:tab w:val="right" w:pos="9638"/>
+        </w:tabs>
+        <w:spacing w:before="0" w:after="0"/>
+      </w:pPr>
+      <w:r>
+        <w:tab/>
+      </w:r>
+      <m:oMath>
+        <m:sSub>
+          <m:e>
+            <m:r>
+              <m:rPr>
+                <m:sty m:val="p"/>
+              </m:rPr>
+              <w:rPr>
+                <w:rFonts w:ascii="Cambria Math" w:hAnsi="Cambria Math"/>
+                <w:sz w:val="28"/>
+                <w:szCs w:val="28"/>
+              </w:rPr>
+              <m:t xml:space="preserve">S3</m:t>
+            </m:r>
+          </m:e>
+          <m:sub>
+            <m:r>
+              <m:rPr>
+                <m:sty m:val="p"/>
+              </m:rPr>
+              <w:rPr>
+                <w:rFonts w:ascii="Cambria Math" w:hAnsi="Cambria Math"/>
+                <w:sz w:val="28"/>
+                <w:szCs w:val="28"/>
+              </w:rPr>
+              <m:t xml:space="preserve">year</m:t>
+            </m:r>
+          </m:sub>
+        </m:sSub>
+        <m:r>
+          <m:rPr>
+            <m:sty m:val="p"/>
+          </m:rPr>
+          <w:rPr>
+            <w:rFonts w:ascii="Cambria Math" w:hAnsi="Cambria Math"/>
+            <w:sz w:val="28"/>
+            <w:szCs w:val="28"/>
+          </w:rPr>
+          <m:t xml:space="preserve">=</m:t>
+        </m:r>
+        <m:f>
+          <m:num>
+            <m:r>
+              <m:rPr>
+                <m:sty m:val="p"/>
+              </m:rPr>
+              <w:rPr>
+                <w:rFonts w:ascii="Cambria Math" w:hAnsi="Cambria Math"/>
+                <w:sz w:val="28"/>
+                <w:szCs w:val="28"/>
+              </w:rPr>
+              <m:t xml:space="preserve">365×</m:t>
+            </m:r>
+            <m:sSub>
+              <m:e>
+                <m:r>
+                  <m:rPr>
+                    <m:sty m:val="p"/>
+                  </m:rPr>
+                  <w:rPr>
+                    <w:rFonts w:ascii="Cambria Math" w:hAnsi="Cambria Math"/>
+                    <w:sz w:val="28"/>
+                    <w:szCs w:val="28"/>
+                  </w:rPr>
+                  <m:t xml:space="preserve">N</m:t>
+                </m:r>
+              </m:e>
+              <m:sub>
+                <m:r>
+                  <m:rPr>
+                    <m:sty m:val="p"/>
+                  </m:rPr>
+                  <w:rPr>
+                    <w:rFonts w:ascii="Cambria Math" w:hAnsi="Cambria Math"/>
+                    <w:sz w:val="28"/>
+                    <w:szCs w:val="28"/>
+                  </w:rPr>
+                  <m:t xml:space="preserve">cmd</m:t>
+                </m:r>
+              </m:sub>
+            </m:sSub>
+            <m:r>
+              <m:rPr>
+                <m:sty m:val="p"/>
+              </m:rPr>
+              <w:rPr>
+                <w:rFonts w:ascii="Cambria Math" w:hAnsi="Cambria Math"/>
+                <w:sz w:val="28"/>
+                <w:szCs w:val="28"/>
+              </w:rPr>
+              <m:t xml:space="preserve">×</m:t>
+            </m:r>
+            <m:sSub>
+              <m:e>
+                <m:r>
+                  <m:rPr>
+                    <m:sty m:val="p"/>
+                  </m:rPr>
+                  <w:rPr>
+                    <w:rFonts w:ascii="Cambria Math" w:hAnsi="Cambria Math"/>
+                    <w:sz w:val="28"/>
+                    <w:szCs w:val="28"/>
+                  </w:rPr>
+                  <m:t xml:space="preserve">S</m:t>
+                </m:r>
+              </m:e>
+              <m:sub>
+                <m:r>
+                  <m:rPr>
+                    <m:sty m:val="p"/>
+                  </m:rPr>
+                  <w:rPr>
+                    <w:rFonts w:ascii="Cambria Math" w:hAnsi="Cambria Math"/>
+                    <w:sz w:val="28"/>
+                    <w:szCs w:val="28"/>
+                  </w:rPr>
+                  <m:t xml:space="preserve">media</m:t>
+                </m:r>
+              </m:sub>
+            </m:sSub>
+          </m:num>
+          <m:den>
+            <m:sSup>
+              <m:e>
+                <m:r>
+                  <m:rPr>
+                    <m:sty m:val="p"/>
+                  </m:rPr>
+                  <w:rPr>
+                    <w:rFonts w:ascii="Cambria Math" w:hAnsi="Cambria Math"/>
+                    <w:sz w:val="28"/>
+                    <w:szCs w:val="28"/>
+                  </w:rPr>
+                  <m:t xml:space="preserve">1024</m:t>
+                </m:r>
+              </m:e>
+              <m:sup>
+                <m:r>
+                  <m:rPr>
+                    <m:sty m:val="p"/>
+                  </m:rPr>
+                  <w:rPr>
+                    <w:rFonts w:ascii="Cambria Math" w:hAnsi="Cambria Math"/>
+                    <w:sz w:val="28"/>
+                    <w:szCs w:val="28"/>
+                  </w:rPr>
+                  <m:t xml:space="preserve">3</m:t>
+                </m:r>
+              </m:sup>
+            </m:sSup>
+          </m:den>
+        </m:f>
+        <m:r>
+          <m:rPr>
+            <m:sty m:val="p"/>
+          </m:rPr>
+          <w:rPr>
+            <w:rFonts w:ascii="Cambria Math" w:hAnsi="Cambria Math"/>
+            <w:sz w:val="28"/>
+            <w:szCs w:val="28"/>
+          </w:rPr>
+          <m:t xml:space="preserve">=</m:t>
+        </m:r>
+        <m:f>
+          <m:num>
+            <m:r>
+              <m:rPr>
+                <m:sty m:val="p"/>
+              </m:rPr>
+              <w:rPr>
+                <w:rFonts w:ascii="Cambria Math" w:hAnsi="Cambria Math"/>
+                <w:sz w:val="28"/>
+                <w:szCs w:val="28"/>
+              </w:rPr>
+              <m:t xml:space="preserve">365×20×799 007</m:t>
+            </m:r>
+          </m:num>
+          <m:den>
+            <m:sSup>
+              <m:e>
+                <m:r>
+                  <m:rPr>
+                    <m:sty m:val="p"/>
+                  </m:rPr>
+                  <w:rPr>
+                    <w:rFonts w:ascii="Cambria Math" w:hAnsi="Cambria Math"/>
+                    <w:sz w:val="28"/>
+                    <w:szCs w:val="28"/>
+                  </w:rPr>
+                  <m:t xml:space="preserve">1024</m:t>
+                </m:r>
+              </m:e>
+              <m:sup>
+                <m:r>
+                  <m:rPr>
+                    <m:sty m:val="p"/>
+                  </m:rPr>
+                  <w:rPr>
+                    <w:rFonts w:ascii="Cambria Math" w:hAnsi="Cambria Math"/>
+                    <w:sz w:val="28"/>
+                    <w:szCs w:val="28"/>
+                  </w:rPr>
+                  <m:t xml:space="preserve">3</m:t>
+                </m:r>
+              </m:sup>
+            </m:sSup>
+          </m:den>
+        </m:f>
+        <m:r>
+          <m:rPr>
+            <m:sty m:val="p"/>
+          </m:rPr>
+          <w:rPr>
+            <w:rFonts w:ascii="Cambria Math" w:hAnsi="Cambria Math"/>
+            <w:sz w:val="28"/>
+            <w:szCs w:val="28"/>
+          </w:rPr>
+          <m:t xml:space="preserve">≈5,43 ГБ/год</m:t>
+        </m:r>
+      </m:oMath>
+      <w:r>
+        <w:tab/>
+        <w:t>(11)</w:t>
+      </w:r>
+    </w:p>
+    <w:p>
+      <w:pPr>
+        <w:tabs>
+          <w:tab w:val="center" w:pos="4819"/>
+          <w:tab w:val="right" w:pos="9638"/>
+        </w:tabs>
+        <w:spacing w:before="0" w:after="0"/>
+      </w:pPr>
+      <w:r>
+        <w:tab/>
+      </w:r>
+      <m:oMath>
+        <m:r>
+          <m:rPr>
+            <m:sty m:val="p"/>
+          </m:rPr>
+          <w:rPr>
+            <w:rFonts w:ascii="Cambria Math" w:hAnsi="Cambria Math"/>
+            <w:sz w:val="28"/>
+            <w:szCs w:val="28"/>
+          </w:rPr>
+          <m:t xml:space="preserve">Disk=5×(</m:t>
+        </m:r>
+        <m:sSub>
+          <m:e>
+            <m:r>
+              <m:rPr>
+                <m:sty m:val="p"/>
+              </m:rPr>
+              <w:rPr>
+                <w:rFonts w:ascii="Cambria Math" w:hAnsi="Cambria Math"/>
+                <w:sz w:val="28"/>
+                <w:szCs w:val="28"/>
+              </w:rPr>
+              <m:t xml:space="preserve">DB</m:t>
+            </m:r>
+          </m:e>
+          <m:sub>
+            <m:r>
+              <m:rPr>
+                <m:sty m:val="p"/>
+              </m:rPr>
+              <w:rPr>
+                <w:rFonts w:ascii="Cambria Math" w:hAnsi="Cambria Math"/>
+                <w:sz w:val="28"/>
+                <w:szCs w:val="28"/>
+              </w:rPr>
+              <m:t xml:space="preserve">year</m:t>
+            </m:r>
+          </m:sub>
+        </m:sSub>
+        <m:r>
+          <m:rPr>
+            <m:sty m:val="p"/>
+          </m:rPr>
+          <w:rPr>
+            <w:rFonts w:ascii="Cambria Math" w:hAnsi="Cambria Math"/>
+            <w:sz w:val="28"/>
+            <w:szCs w:val="28"/>
+          </w:rPr>
+          <m:t xml:space="preserve">+</m:t>
+        </m:r>
+        <m:sSub>
+          <m:e>
+            <m:r>
+              <m:rPr>
+                <m:sty m:val="p"/>
+              </m:rPr>
+              <w:rPr>
+                <w:rFonts w:ascii="Cambria Math" w:hAnsi="Cambria Math"/>
+                <w:sz w:val="28"/>
+                <w:szCs w:val="28"/>
+              </w:rPr>
+              <m:t xml:space="preserve">S3</m:t>
+            </m:r>
+          </m:e>
+          <m:sub>
+            <m:r>
+              <m:rPr>
+                <m:sty m:val="p"/>
+              </m:rPr>
+              <w:rPr>
+                <w:rFonts w:ascii="Cambria Math" w:hAnsi="Cambria Math"/>
+                <w:sz w:val="28"/>
+                <w:szCs w:val="28"/>
+              </w:rPr>
+              <m:t xml:space="preserve">year</m:t>
+            </m:r>
+          </m:sub>
+        </m:sSub>
+        <m:r>
+          <m:rPr>
+            <m:sty m:val="p"/>
+          </m:rPr>
+          <w:rPr>
+            <w:rFonts w:ascii="Cambria Math" w:hAnsi="Cambria Math"/>
+            <w:sz w:val="28"/>
+            <w:szCs w:val="28"/>
+          </w:rPr>
+          <m:t xml:space="preserve">)+</m:t>
+        </m:r>
+        <m:sSub>
+          <m:e>
+            <m:r>
+              <m:rPr>
+                <m:sty m:val="p"/>
+              </m:rPr>
+              <w:rPr>
+                <w:rFonts w:ascii="Cambria Math" w:hAnsi="Cambria Math"/>
+                <w:sz w:val="28"/>
+                <w:szCs w:val="28"/>
+              </w:rPr>
+              <m:t xml:space="preserve">N</m:t>
+            </m:r>
+          </m:e>
+          <m:sub>
+            <m:r>
+              <m:rPr>
+                <m:sty m:val="p"/>
+              </m:rPr>
+              <w:rPr>
+                <w:rFonts w:ascii="Cambria Math" w:hAnsi="Cambria Math"/>
+                <w:sz w:val="28"/>
+                <w:szCs w:val="28"/>
+              </w:rPr>
+              <m:t xml:space="preserve">reserve</m:t>
+            </m:r>
+          </m:sub>
+        </m:sSub>
+        <m:r>
+          <m:rPr>
+            <m:sty m:val="p"/>
+          </m:rPr>
+          <w:rPr>
+            <w:rFonts w:ascii="Cambria Math" w:hAnsi="Cambria Math"/>
+            <w:sz w:val="28"/>
+            <w:szCs w:val="28"/>
+          </w:rPr>
+          <m:t xml:space="preserve">=5×5,48+10≈37,4 ГБ</m:t>
+        </m:r>
+      </m:oMath>
+      <w:r>
+        <w:tab/>
+        <w:t>(12)</w:t>
+      </w:r>
+    </w:p>
+    <w:p>
+      <w:pPr>
         <w:pStyle w:val="1"/>
         <w:pageBreakBefore/>
       </w:pPr>
@@ -6075,7 +8363,7 @@
         <w:spacing w:before="120" w:line="360" w:lineRule="auto"/>
       </w:pPr>
       <w:r>
-        <w:t>Таблица 4 – HTTP-методы веб-сервиса</w:t>
+        <w:t>Таблица 5 – HTTP-методы веб-сервиса</w:t>
       </w:r>
     </w:p>
     <w:tbl>

</xml_diff>